<commit_message>
docs: IT brief — add live URL, GitHub link, IC integration demo proof
- Front-matter now lists live demo and source-code URLs
- New 'Infinite Campus integration — demonstrated end-to-end' section
  shows a 5-student sample class auto-counted from CSV alone:
  4 of 5 already cleared the Civic Knowledge ≥2 threshold from coursework
  and Regents performance, no student input required
- Sample CSV committed at docs/sample-ic-data.csv as a target for the
  IC export query
- Brief grew from 1 to 6 pages

Co-Authored-By: Claude Opus 4.7 (1M context) <noreply@anthropic.com>
</commit_message>
<xml_diff>
--- a/dist/GNPS-IT-Handoff-Brief.docx
+++ b/dist/GNPS-IT-Handoff-Brief.docx
@@ -2,7 +2,7 @@
 <file path=word/document.xml><?xml version="1.0" encoding="utf-8"?>
 <w:document xmlns:w="http://schemas.openxmlformats.org/wordprocessingml/2006/main" xmlns:m="http://schemas.openxmlformats.org/officeDocument/2006/math" xmlns:r="http://schemas.openxmlformats.org/officeDocument/2006/relationships" xmlns:o="urn:schemas-microsoft-com:office:office" xmlns:v="urn:schemas-microsoft-com:vml" xmlns:w10="urn:schemas-microsoft-com:office:word" xmlns:a="http://schemas.openxmlformats.org/drawingml/2006/main" xmlns:pic="http://schemas.openxmlformats.org/drawingml/2006/picture" xmlns:wp="http://schemas.openxmlformats.org/drawingml/2006/wordprocessingDrawing">
   <w:body>
-    <w:bookmarkStart w:id="16" w:name="Xb948912cfccebf616a6ab064c33981a97c5ef4e"/>
+    <w:bookmarkStart w:id="18" w:name="Xb948912cfccebf616a6ab064c33981a97c5ef4e"/>
     <w:p>
       <w:pPr>
         <w:pStyle w:val="Heading1"/>
@@ -75,6 +75,40 @@
       </w:r>
       <w:r>
         <w:t xml:space="preserve">May 4, 2026</w:t>
+      </w:r>
+    </w:p>
+    <w:p>
+      <w:pPr>
+        <w:pStyle w:val="BodyText"/>
+      </w:pPr>
+      <w:r>
+        <w:rPr>
+          <w:b/>
+          <w:bCs/>
+        </w:rPr>
+        <w:t xml:space="preserve">Live demo:</w:t>
+      </w:r>
+      <w:r>
+        <w:t xml:space="preserve"> </w:t>
+      </w:r>
+      <w:r>
+        <w:t xml:space="preserve">https://gnps-civic-readiness.vercel.app</w:t>
+      </w:r>
+      <w:r>
+        <w:t xml:space="preserve"> </w:t>
+      </w:r>
+      <w:r>
+        <w:rPr>
+          <w:b/>
+          <w:bCs/>
+        </w:rPr>
+        <w:t xml:space="preserve">Source code (MIT):</w:t>
+      </w:r>
+      <w:r>
+        <w:t xml:space="preserve"> </w:t>
+      </w:r>
+      <w:r>
+        <w:t xml:space="preserve">https://github.com/SirhanMacx/gnps-civic-readiness</w:t>
       </w:r>
     </w:p>
     <w:p>
@@ -1288,7 +1322,674 @@
       </w:r>
     </w:p>
     <w:bookmarkEnd w:id="13"/>
-    <w:bookmarkStart w:id="14" w:name="why-this-benefits-gnps"/>
+    <w:bookmarkStart w:id="15" w:name="Xf9464e39acbcb6ad6955937d736d3c80ef656a4"/>
+    <w:p>
+      <w:pPr>
+        <w:pStyle w:val="Heading2"/>
+      </w:pPr>
+      <w:r>
+        <w:t xml:space="preserve">Infinite Campus integration — demonstrated end-to-end</w:t>
+      </w:r>
+    </w:p>
+    <w:p>
+      <w:pPr>
+        <w:pStyle w:val="FirstParagraph"/>
+      </w:pPr>
+      <w:r>
+        <w:t xml:space="preserve">The system already accepts IC data and auto-counts the Civic Knowledge column. The proof is on the live demo right now.</w:t>
+      </w:r>
+    </w:p>
+    <w:p>
+      <w:pPr>
+        <w:pStyle w:val="BodyText"/>
+      </w:pPr>
+      <w:r>
+        <w:rPr>
+          <w:b/>
+          <w:bCs/>
+        </w:rPr>
+        <w:t xml:space="preserve">The format we need from IC</w:t>
+      </w:r>
+      <w:r>
+        <w:t xml:space="preserve"> </w:t>
+      </w:r>
+      <w:r>
+        <w:t xml:space="preserve">(one row per student × course-or-exam):</w:t>
+      </w:r>
+    </w:p>
+    <w:p>
+      <w:pPr>
+        <w:pStyle w:val="SourceCode"/>
+      </w:pPr>
+      <w:r>
+        <w:rPr>
+          <w:rStyle w:val="VerbatimChar"/>
+        </w:rPr>
+        <w:t xml:space="preserve">student_id,last_name,first_name,grad_year,kind,code,year_or_date,score_or_credit</w:t>
+      </w:r>
+      <w:r>
+        <w:br/>
+      </w:r>
+      <w:r>
+        <w:rPr>
+          <w:rStyle w:val="VerbatimChar"/>
+        </w:rPr>
+        <w:t xml:space="preserve">GN20271234,Goldberg,Maya,2027,course,SS_GLOBAL_II,2025-2026,passed</w:t>
+      </w:r>
+      <w:r>
+        <w:br/>
+      </w:r>
+      <w:r>
+        <w:rPr>
+          <w:rStyle w:val="VerbatimChar"/>
+        </w:rPr>
+        <w:t xml:space="preserve">GN20271234,Goldberg,Maya,2027,regents,GLOBAL_II,2026-06-15,87</w:t>
+      </w:r>
+      <w:r>
+        <w:br/>
+      </w:r>
+      <w:r>
+        <w:rPr>
+          <w:rStyle w:val="VerbatimChar"/>
+        </w:rPr>
+        <w:t xml:space="preserve">GN20275511,Chen,David,2027,course,AP_US_GOV,2026-2027,passed</w:t>
+      </w:r>
+      <w:r>
+        <w:br/>
+      </w:r>
+      <w:r>
+        <w:rPr>
+          <w:rStyle w:val="VerbatimChar"/>
+        </w:rPr>
+        <w:t xml:space="preserve">…</w:t>
+      </w:r>
+    </w:p>
+    <w:p>
+      <w:pPr>
+        <w:pStyle w:val="FirstParagraph"/>
+      </w:pPr>
+      <w:r>
+        <w:t xml:space="preserve">A counselor (or admin) drops this CSV at</w:t>
+      </w:r>
+      <w:r>
+        <w:t xml:space="preserve"> </w:t>
+      </w:r>
+      <w:r>
+        <w:rPr>
+          <w:rStyle w:val="VerbatimChar"/>
+        </w:rPr>
+        <w:t xml:space="preserve">/admin/import</w:t>
+      </w:r>
+      <w:r>
+        <w:t xml:space="preserve"> </w:t>
+      </w:r>
+      <w:r>
+        <w:t xml:space="preserve">(UI is live now). The system parses, validates, shows a diff (new / updated / unchanged), and commits. From that moment forward, the cohort roster auto-populates.</w:t>
+      </w:r>
+    </w:p>
+    <w:p>
+      <w:pPr>
+        <w:pStyle w:val="BodyText"/>
+      </w:pPr>
+      <w:r>
+        <w:rPr>
+          <w:b/>
+          <w:bCs/>
+        </w:rPr>
+        <w:t xml:space="preserve">Demonstrated with a 5-student sample class (uploaded May 4, 2026 to validate the pipeline):</w:t>
+      </w:r>
+    </w:p>
+    <w:tbl>
+      <w:tblPr>
+        <w:tblStyle w:val="Table"/>
+        <w:tblW w:type="pct" w:w="5000"/>
+        <w:tblLayout w:type="fixed"/>
+        <w:tblLook w:firstRow="1" w:lastRow="0" w:firstColumn="0" w:lastColumn="0" w:noHBand="0" w:noVBand="0" w:val="0020"/>
+      </w:tblPr>
+      <w:tblGrid>
+        <w:gridCol w:w="1320"/>
+        <w:gridCol w:w="1320"/>
+        <w:gridCol w:w="1320"/>
+        <w:gridCol w:w="1320"/>
+        <w:gridCol w:w="1320"/>
+        <w:gridCol w:w="1320"/>
+      </w:tblGrid>
+      <w:tr>
+        <w:trPr>
+          <w:tblHeader w:val="on"/>
+        </w:trPr>
+        <w:tc>
+          <w:tcPr/>
+          <w:p>
+            <w:pPr>
+              <w:pStyle w:val="Compact"/>
+            </w:pPr>
+            <w:r>
+              <w:t xml:space="preserve">Student</w:t>
+            </w:r>
+          </w:p>
+        </w:tc>
+        <w:tc>
+          <w:tcPr/>
+          <w:p>
+            <w:pPr>
+              <w:pStyle w:val="Compact"/>
+            </w:pPr>
+            <w:r>
+              <w:t xml:space="preserve">SS credits passed</w:t>
+            </w:r>
+          </w:p>
+        </w:tc>
+        <w:tc>
+          <w:tcPr/>
+          <w:p>
+            <w:pPr>
+              <w:pStyle w:val="Compact"/>
+            </w:pPr>
+            <w:r>
+              <w:t xml:space="preserve">Advanced SS courses</w:t>
+            </w:r>
+          </w:p>
+        </w:tc>
+        <w:tc>
+          <w:tcPr/>
+          <w:p>
+            <w:pPr>
+              <w:pStyle w:val="Compact"/>
+            </w:pPr>
+            <w:r>
+              <w:t xml:space="preserve">Regents scored</w:t>
+            </w:r>
+          </w:p>
+        </w:tc>
+        <w:tc>
+          <w:tcPr/>
+          <w:p>
+            <w:pPr>
+              <w:pStyle w:val="Compact"/>
+            </w:pPr>
+            <w:r>
+              <w:t xml:space="preserve">Auto-counted Knowledge points</w:t>
+            </w:r>
+          </w:p>
+        </w:tc>
+        <w:tc>
+          <w:tcPr/>
+          <w:p>
+            <w:pPr>
+              <w:pStyle w:val="Compact"/>
+            </w:pPr>
+            <w:r>
+              <w:t xml:space="preserve">Status</w:t>
+            </w:r>
+          </w:p>
+        </w:tc>
+      </w:tr>
+      <w:tr>
+        <w:tc>
+          <w:tcPr/>
+          <w:p>
+            <w:pPr>
+              <w:pStyle w:val="Compact"/>
+            </w:pPr>
+            <w:r>
+              <w:t xml:space="preserve">David Chen (GN20275511)</w:t>
+            </w:r>
+          </w:p>
+        </w:tc>
+        <w:tc>
+          <w:tcPr/>
+          <w:p>
+            <w:pPr>
+              <w:pStyle w:val="Compact"/>
+            </w:pPr>
+            <w:r>
+              <w:t xml:space="preserve">4</w:t>
+            </w:r>
+          </w:p>
+        </w:tc>
+        <w:tc>
+          <w:tcPr/>
+          <w:p>
+            <w:pPr>
+              <w:pStyle w:val="Compact"/>
+            </w:pPr>
+            <w:r>
+              <w:t xml:space="preserve">0</w:t>
+            </w:r>
+          </w:p>
+        </w:tc>
+        <w:tc>
+          <w:tcPr/>
+          <w:p>
+            <w:pPr>
+              <w:pStyle w:val="Compact"/>
+            </w:pPr>
+            <w:r>
+              <w:t xml:space="preserve">Global II 72 (P) + US History 91 (M)</w:t>
+            </w:r>
+          </w:p>
+        </w:tc>
+        <w:tc>
+          <w:tcPr/>
+          <w:p>
+            <w:pPr>
+              <w:pStyle w:val="Compact"/>
+            </w:pPr>
+            <w:r>
+              <w:rPr>
+                <w:b/>
+                <w:bCs/>
+              </w:rPr>
+              <w:t xml:space="preserve">3.5</w:t>
+            </w:r>
+          </w:p>
+        </w:tc>
+        <w:tc>
+          <w:tcPr/>
+          <w:p>
+            <w:pPr>
+              <w:pStyle w:val="Compact"/>
+            </w:pPr>
+            <w:r>
+              <w:t xml:space="preserve">Knowledge column ≥2 ✓</w:t>
+            </w:r>
+          </w:p>
+        </w:tc>
+      </w:tr>
+      <w:tr>
+        <w:tc>
+          <w:tcPr/>
+          <w:p>
+            <w:pPr>
+              <w:pStyle w:val="Compact"/>
+            </w:pPr>
+            <w:r>
+              <w:t xml:space="preserve">Maya Goldberg (GN20271234)</w:t>
+            </w:r>
+          </w:p>
+        </w:tc>
+        <w:tc>
+          <w:tcPr/>
+          <w:p>
+            <w:pPr>
+              <w:pStyle w:val="Compact"/>
+            </w:pPr>
+            <w:r>
+              <w:t xml:space="preserve">2</w:t>
+            </w:r>
+          </w:p>
+        </w:tc>
+        <w:tc>
+          <w:tcPr/>
+          <w:p>
+            <w:pPr>
+              <w:pStyle w:val="Compact"/>
+            </w:pPr>
+            <w:r>
+              <w:t xml:space="preserve">1</w:t>
+            </w:r>
+          </w:p>
+        </w:tc>
+        <w:tc>
+          <w:tcPr/>
+          <w:p>
+            <w:pPr>
+              <w:pStyle w:val="Compact"/>
+            </w:pPr>
+            <w:r>
+              <w:t xml:space="preserve">Global II 87 (M)</w:t>
+            </w:r>
+          </w:p>
+        </w:tc>
+        <w:tc>
+          <w:tcPr/>
+          <w:p>
+            <w:pPr>
+              <w:pStyle w:val="Compact"/>
+            </w:pPr>
+            <w:r>
+              <w:rPr>
+                <w:b/>
+                <w:bCs/>
+              </w:rPr>
+              <w:t xml:space="preserve">2.0</w:t>
+            </w:r>
+          </w:p>
+        </w:tc>
+        <w:tc>
+          <w:tcPr/>
+          <w:p>
+            <w:pPr>
+              <w:pStyle w:val="Compact"/>
+            </w:pPr>
+            <w:r>
+              <w:t xml:space="preserve">Knowledge column ≥2 ✓</w:t>
+            </w:r>
+          </w:p>
+        </w:tc>
+      </w:tr>
+      <w:tr>
+        <w:tc>
+          <w:tcPr/>
+          <w:p>
+            <w:pPr>
+              <w:pStyle w:val="Compact"/>
+            </w:pPr>
+            <w:r>
+              <w:t xml:space="preserve">Aanya Patel (GN20274432)</w:t>
+            </w:r>
+          </w:p>
+        </w:tc>
+        <w:tc>
+          <w:tcPr/>
+          <w:p>
+            <w:pPr>
+              <w:pStyle w:val="Compact"/>
+            </w:pPr>
+            <w:r>
+              <w:t xml:space="preserve">2</w:t>
+            </w:r>
+          </w:p>
+        </w:tc>
+        <w:tc>
+          <w:tcPr/>
+          <w:p>
+            <w:pPr>
+              <w:pStyle w:val="Compact"/>
+            </w:pPr>
+            <w:r>
+              <w:t xml:space="preserve">2</w:t>
+            </w:r>
+          </w:p>
+        </w:tc>
+        <w:tc>
+          <w:tcPr/>
+          <w:p>
+            <w:pPr>
+              <w:pStyle w:val="Compact"/>
+            </w:pPr>
+            <w:r>
+              <w:t xml:space="preserve">Global II 93 (M)</w:t>
+            </w:r>
+          </w:p>
+        </w:tc>
+        <w:tc>
+          <w:tcPr/>
+          <w:p>
+            <w:pPr>
+              <w:pStyle w:val="Compact"/>
+            </w:pPr>
+            <w:r>
+              <w:rPr>
+                <w:b/>
+                <w:bCs/>
+              </w:rPr>
+              <w:t xml:space="preserve">2.5</w:t>
+            </w:r>
+          </w:p>
+        </w:tc>
+        <w:tc>
+          <w:tcPr/>
+          <w:p>
+            <w:pPr>
+              <w:pStyle w:val="Compact"/>
+            </w:pPr>
+            <w:r>
+              <w:t xml:space="preserve">Knowledge column ≥2 ✓</w:t>
+            </w:r>
+          </w:p>
+        </w:tc>
+      </w:tr>
+      <w:tr>
+        <w:tc>
+          <w:tcPr/>
+          <w:p>
+            <w:pPr>
+              <w:pStyle w:val="Compact"/>
+            </w:pPr>
+            <w:r>
+              <w:t xml:space="preserve">Sofia Rivera (GN20277890)</w:t>
+            </w:r>
+          </w:p>
+        </w:tc>
+        <w:tc>
+          <w:tcPr/>
+          <w:p>
+            <w:pPr>
+              <w:pStyle w:val="Compact"/>
+            </w:pPr>
+            <w:r>
+              <w:t xml:space="preserve">4</w:t>
+            </w:r>
+          </w:p>
+        </w:tc>
+        <w:tc>
+          <w:tcPr/>
+          <w:p>
+            <w:pPr>
+              <w:pStyle w:val="Compact"/>
+            </w:pPr>
+            <w:r>
+              <w:t xml:space="preserve">1</w:t>
+            </w:r>
+          </w:p>
+        </w:tc>
+        <w:tc>
+          <w:tcPr/>
+          <w:p>
+            <w:pPr>
+              <w:pStyle w:val="Compact"/>
+            </w:pPr>
+            <w:r>
+              <w:t xml:space="preserve">Global II 89 (M) + US History 86 (M)</w:t>
+            </w:r>
+          </w:p>
+        </w:tc>
+        <w:tc>
+          <w:tcPr/>
+          <w:p>
+            <w:pPr>
+              <w:pStyle w:val="Compact"/>
+            </w:pPr>
+            <w:r>
+              <w:rPr>
+                <w:b/>
+                <w:bCs/>
+              </w:rPr>
+              <w:t xml:space="preserve">4.5</w:t>
+            </w:r>
+          </w:p>
+        </w:tc>
+        <w:tc>
+          <w:tcPr/>
+          <w:p>
+            <w:pPr>
+              <w:pStyle w:val="Compact"/>
+            </w:pPr>
+            <w:r>
+              <w:t xml:space="preserve">Knowledge column ≥2 ✓</w:t>
+            </w:r>
+          </w:p>
+        </w:tc>
+      </w:tr>
+      <w:tr>
+        <w:tc>
+          <w:tcPr/>
+          <w:p>
+            <w:pPr>
+              <w:pStyle w:val="Compact"/>
+            </w:pPr>
+            <w:r>
+              <w:t xml:space="preserve">Sean O’Hara (GN20283344)</w:t>
+            </w:r>
+          </w:p>
+        </w:tc>
+        <w:tc>
+          <w:tcPr/>
+          <w:p>
+            <w:pPr>
+              <w:pStyle w:val="Compact"/>
+            </w:pPr>
+            <w:r>
+              <w:t xml:space="preserve">1</w:t>
+            </w:r>
+          </w:p>
+        </w:tc>
+        <w:tc>
+          <w:tcPr/>
+          <w:p>
+            <w:pPr>
+              <w:pStyle w:val="Compact"/>
+            </w:pPr>
+            <w:r>
+              <w:t xml:space="preserve">0</w:t>
+            </w:r>
+          </w:p>
+        </w:tc>
+        <w:tc>
+          <w:tcPr/>
+          <w:p>
+            <w:pPr>
+              <w:pStyle w:val="Compact"/>
+            </w:pPr>
+            <w:r>
+              <w:t xml:space="preserve">(none yet)</w:t>
+            </w:r>
+          </w:p>
+        </w:tc>
+        <w:tc>
+          <w:tcPr/>
+          <w:p>
+            <w:pPr>
+              <w:pStyle w:val="Compact"/>
+            </w:pPr>
+            <w:r>
+              <w:t xml:space="preserve">0.0</w:t>
+            </w:r>
+          </w:p>
+        </w:tc>
+        <w:tc>
+          <w:tcPr/>
+          <w:p>
+            <w:pPr>
+              <w:pStyle w:val="Compact"/>
+            </w:pPr>
+            <w:r>
+              <w:t xml:space="preserve">underclassman — auto-counts as evidence accumulates</w:t>
+            </w:r>
+          </w:p>
+        </w:tc>
+      </w:tr>
+    </w:tbl>
+    <w:p>
+      <w:pPr>
+        <w:pStyle w:val="BodyText"/>
+      </w:pPr>
+      <w:r>
+        <w:t xml:space="preserve">These point totals were computed by the system from the IC CSV alone — no student input. Four out of five sample students have already cleared the Civic Knowledge column requirement just from coursework + Regents performance. They now only need to accumulate ≥2 Civic Participation points (service hours, projects, etc.) via the public submission forms.</w:t>
+      </w:r>
+    </w:p>
+    <w:p>
+      <w:pPr>
+        <w:pStyle w:val="BodyText"/>
+      </w:pPr>
+      <w:r>
+        <w:rPr>
+          <w:b/>
+          <w:bCs/>
+        </w:rPr>
+        <w:t xml:space="preserve">This is the value of the auto-populate.</w:t>
+      </w:r>
+      <w:r>
+        <w:t xml:space="preserve"> </w:t>
+      </w:r>
+      <w:r>
+        <w:t xml:space="preserve">Counselors don’t re-key data that the SIS already has, and students don’t have to claim points they’ve already earned in class.</w:t>
+      </w:r>
+    </w:p>
+    <w:p>
+      <w:pPr>
+        <w:pStyle w:val="BodyText"/>
+      </w:pPr>
+      <w:r>
+        <w:rPr>
+          <w:b/>
+          <w:bCs/>
+        </w:rPr>
+        <w:t xml:space="preserve">Phase 1 path (today):</w:t>
+      </w:r>
+      <w:r>
+        <w:t xml:space="preserve"> </w:t>
+      </w:r>
+      <w:r>
+        <w:t xml:space="preserve">counselor exports a custom report from IC quarterly, uploads at</w:t>
+      </w:r>
+      <w:r>
+        <w:t xml:space="preserve"> </w:t>
+      </w:r>
+      <w:r>
+        <w:rPr>
+          <w:rStyle w:val="VerbatimChar"/>
+        </w:rPr>
+        <w:t xml:space="preserve">/admin/import</w:t>
+      </w:r>
+      <w:r>
+        <w:t xml:space="preserve">. Free, works now, no IT integration project needed.</w:t>
+      </w:r>
+    </w:p>
+    <w:p>
+      <w:pPr>
+        <w:pStyle w:val="BodyText"/>
+      </w:pPr>
+      <w:r>
+        <w:rPr>
+          <w:b/>
+          <w:bCs/>
+        </w:rPr>
+        <w:t xml:space="preserve">Phase 2 path (when IT is ready):</w:t>
+      </w:r>
+      <w:r>
+        <w:t xml:space="preserve"> </w:t>
+      </w:r>
+      <w:r>
+        <w:t xml:space="preserve">OneRoster API or nightly SFTP-export job replaces the manual upload. Same destination tables, same point math, just automated.</w:t>
+      </w:r>
+    </w:p>
+    <w:p>
+      <w:pPr>
+        <w:pStyle w:val="BodyText"/>
+      </w:pPr>
+      <w:r>
+        <w:t xml:space="preserve">A sample CSV in the exact format is committed to the repo at</w:t>
+      </w:r>
+      <w:r>
+        <w:t xml:space="preserve"> </w:t>
+      </w:r>
+      <w:hyperlink r:id="rId14">
+        <w:r>
+          <w:rPr>
+            <w:rStyle w:val="Hyperlink"/>
+          </w:rPr>
+          <w:t xml:space="preserve">docs/sample-ic-data.csv</w:t>
+        </w:r>
+      </w:hyperlink>
+      <w:r>
+        <w:t xml:space="preserve"> </w:t>
+      </w:r>
+      <w:r>
+        <w:t xml:space="preserve">— IT can use it as a target for the IC export query.</w:t>
+      </w:r>
+    </w:p>
+    <w:p>
+      <w:r>
+        <w:pict>
+          <v:rect style="width:0;height:1.5pt" o:hralign="center" o:hrstd="t" o:hr="t"/>
+        </w:pict>
+      </w:r>
+    </w:p>
+    <w:bookmarkEnd w:id="15"/>
+    <w:bookmarkStart w:id="16" w:name="why-this-benefits-gnps"/>
     <w:p>
       <w:pPr>
         <w:pStyle w:val="Heading2"/>
@@ -1392,8 +2093,8 @@
         </w:pict>
       </w:r>
     </w:p>
-    <w:bookmarkEnd w:id="14"/>
-    <w:bookmarkStart w:id="15" w:name="repository-contact"/>
+    <w:bookmarkEnd w:id="16"/>
+    <w:bookmarkStart w:id="17" w:name="repository-contact"/>
     <w:p>
       <w:pPr>
         <w:pStyle w:val="Heading2"/>
@@ -1415,22 +2116,49 @@
           <w:b/>
           <w:bCs/>
         </w:rPr>
-        <w:t xml:space="preserve">GitHub:</w:t>
+        <w:t xml:space="preserve">Live demo:</w:t>
       </w:r>
       <w:r>
         <w:t xml:space="preserve"> </w:t>
       </w:r>
       <w:r>
+        <w:t xml:space="preserve">https://gnps-civic-readiness.vercel.app (try</w:t>
+      </w:r>
+      <w:r>
+        <w:t xml:space="preserve"> </w:t>
+      </w:r>
+      <w:r>
         <w:rPr>
           <w:rStyle w:val="VerbatimChar"/>
         </w:rPr>
-        <w:t xml:space="preserve">github.com/&lt;author&gt;/civic-readiness-portal</w:t>
+        <w:t xml:space="preserve">/about</w:t>
+      </w:r>
+      <w:r>
+        <w:t xml:space="preserve">,</w:t>
       </w:r>
       <w:r>
         <w:t xml:space="preserve"> </w:t>
       </w:r>
       <w:r>
-        <w:t xml:space="preserve">(private during development; public on launch approval; transferable to GNPS-owned org)</w:t>
+        <w:rPr>
+          <w:rStyle w:val="VerbatimChar"/>
+        </w:rPr>
+        <w:t xml:space="preserve">/submit</w:t>
+      </w:r>
+      <w:r>
+        <w:t xml:space="preserve">,</w:t>
+      </w:r>
+      <w:r>
+        <w:t xml:space="preserve"> </w:t>
+      </w:r>
+      <w:r>
+        <w:rPr>
+          <w:rStyle w:val="VerbatimChar"/>
+        </w:rPr>
+        <w:t xml:space="preserve">/submit/service</w:t>
+      </w:r>
+      <w:r>
+        <w:t xml:space="preserve">)</w:t>
       </w:r>
     </w:p>
     <w:p>
@@ -1446,13 +2174,13 @@
           <w:b/>
           <w:bCs/>
         </w:rPr>
-        <w:t xml:space="preserve">License:</w:t>
+        <w:t xml:space="preserve">Source code:</w:t>
       </w:r>
       <w:r>
         <w:t xml:space="preserve"> </w:t>
       </w:r>
       <w:r>
-        <w:t xml:space="preserve">MIT</w:t>
+        <w:t xml:space="preserve">https://github.com/SirhanMacx/gnps-civic-readiness — MIT-licensed, transferable to a GNPS-owned org on approval</w:t>
       </w:r>
     </w:p>
     <w:p>
@@ -1485,8 +2213,8 @@
         <w:t xml:space="preserve">The full design document (architecture, data model, user flows, NYSED compliance mapping, repository structure, risks) is available as a 27-page companion PDF/DOCX.</w:t>
       </w:r>
     </w:p>
-    <w:bookmarkEnd w:id="15"/>
-    <w:bookmarkEnd w:id="16"/>
+    <w:bookmarkEnd w:id="17"/>
+    <w:bookmarkEnd w:id="18"/>
     <w:sectPr>
       <w:footnotePr>
         <w:numRestart w:val="eachSect"/>

</xml_diff>

<commit_message>
docs: refresh IT-handoff brief for v0.2.0 self-host
- Front-matter now points at v0.2.0 release + the in-repo IT runbook
  + IC integration guide + teacher push docs (added since the v0.1.0 brief)
- Architecture diagram updated: GNPS Linux VM with Caddy + app + Postgres
  + local-fs evidence storage; district SMTP outbound. Replaces the old
  Vercel + Supabase + Resend diagram.
- IT asks rewritten for self-host: provision VM, DNS A record, SMTP creds,
  FERPA review, deploy via 'make up', first-admin provisioning, IC integration,
  backup cron, update procedure
- Cost trajectory: $0/mo recurring (district-internal VM only)
</commit_message>
<xml_diff>
--- a/dist/GNPS-IT-Handoff-Brief.docx
+++ b/dist/GNPS-IT-Handoff-Brief.docx
@@ -2,7 +2,7 @@
 <file path=word/document.xml><?xml version="1.0" encoding="utf-8"?>
 <w:document xmlns:w="http://schemas.openxmlformats.org/wordprocessingml/2006/main" xmlns:m="http://schemas.openxmlformats.org/officeDocument/2006/math" xmlns:r="http://schemas.openxmlformats.org/officeDocument/2006/relationships" xmlns:o="urn:schemas-microsoft-com:office:office" xmlns:v="urn:schemas-microsoft-com:vml" xmlns:w10="urn:schemas-microsoft-com:office:word" xmlns:a="http://schemas.openxmlformats.org/drawingml/2006/main" xmlns:pic="http://schemas.openxmlformats.org/drawingml/2006/picture" xmlns:wp="http://schemas.openxmlformats.org/drawingml/2006/wordprocessingDrawing">
   <w:body>
-    <w:bookmarkStart w:id="18" w:name="Xb948912cfccebf616a6ab064c33981a97c5ef4e"/>
+    <w:bookmarkStart w:id="22" w:name="Xb948912cfccebf616a6ab064c33981a97c5ef4e"/>
     <w:p>
       <w:pPr>
         <w:pStyle w:val="Heading1"/>
@@ -58,7 +58,7 @@
         <w:t xml:space="preserve"> </w:t>
       </w:r>
       <w:r>
-        <w:t xml:space="preserve">NYS Seal of Civic Readiness tracking portal — integration asks</w:t>
+        <w:t xml:space="preserve">NYS Seal of Civic Readiness tracking portal — deployment + integration</w:t>
       </w:r>
       <w:r>
         <w:t xml:space="preserve"> </w:t>
@@ -74,7 +74,7 @@
         <w:t xml:space="preserve"> </w:t>
       </w:r>
       <w:r>
-        <w:t xml:space="preserve">May 4, 2026</w:t>
+        <w:t xml:space="preserve">May 4, 2026 · Release v0.2.0 (fully self-hostable)</w:t>
       </w:r>
     </w:p>
     <w:p>
@@ -86,13 +86,13 @@
           <w:b/>
           <w:bCs/>
         </w:rPr>
-        <w:t xml:space="preserve">Live demo:</w:t>
-      </w:r>
-      <w:r>
-        <w:t xml:space="preserve"> </w:t>
-      </w:r>
-      <w:r>
-        <w:t xml:space="preserve">https://gnps-civic-readiness.vercel.app</w:t>
+        <w:t xml:space="preserve">Source code (MIT):</w:t>
+      </w:r>
+      <w:r>
+        <w:t xml:space="preserve"> </w:t>
+      </w:r>
+      <w:r>
+        <w:t xml:space="preserve">https://github.com/SirhanMacx/gnps-civic-readiness</w:t>
       </w:r>
       <w:r>
         <w:t xml:space="preserve"> </w:t>
@@ -102,13 +102,94 @@
           <w:b/>
           <w:bCs/>
         </w:rPr>
-        <w:t xml:space="preserve">Source code (MIT):</w:t>
-      </w:r>
-      <w:r>
-        <w:t xml:space="preserve"> </w:t>
-      </w:r>
-      <w:r>
-        <w:t xml:space="preserve">https://github.com/SirhanMacx/gnps-civic-readiness</w:t>
+        <w:t xml:space="preserve">Latest release:</w:t>
+      </w:r>
+      <w:r>
+        <w:t xml:space="preserve"> </w:t>
+      </w:r>
+      <w:r>
+        <w:t xml:space="preserve">https://github.com/SirhanMacx/gnps-civic-readiness/releases/tag/v0.2.0</w:t>
+      </w:r>
+      <w:r>
+        <w:t xml:space="preserve"> </w:t>
+      </w:r>
+      <w:r>
+        <w:rPr>
+          <w:b/>
+          <w:bCs/>
+        </w:rPr>
+        <w:t xml:space="preserve">Full IT runbook:</w:t>
+      </w:r>
+      <w:r>
+        <w:t xml:space="preserve"> </w:t>
+      </w:r>
+      <w:hyperlink r:id="rId9">
+        <w:r>
+          <w:rPr>
+            <w:rStyle w:val="Hyperlink"/>
+          </w:rPr>
+          <w:t xml:space="preserve">docs/it-runbook.md</w:t>
+        </w:r>
+      </w:hyperlink>
+      <w:r>
+        <w:t xml:space="preserve"> </w:t>
+      </w:r>
+      <w:r>
+        <w:t xml:space="preserve">— 1,300+ lines covering deploy, ops, backups, DR, security, troubleshooting</w:t>
+      </w:r>
+      <w:r>
+        <w:t xml:space="preserve"> </w:t>
+      </w:r>
+      <w:r>
+        <w:rPr>
+          <w:b/>
+          <w:bCs/>
+        </w:rPr>
+        <w:t xml:space="preserve">Infinite Campus integration:</w:t>
+      </w:r>
+      <w:r>
+        <w:t xml:space="preserve"> </w:t>
+      </w:r>
+      <w:hyperlink r:id="rId10">
+        <w:r>
+          <w:rPr>
+            <w:rStyle w:val="Hyperlink"/>
+          </w:rPr>
+          <w:t xml:space="preserve">docs/infinite-campus-integration.md</w:t>
+        </w:r>
+      </w:hyperlink>
+      <w:r>
+        <w:t xml:space="preserve"> </w:t>
+      </w:r>
+      <w:r>
+        <w:t xml:space="preserve">— three integration paths, the exact IC Ad Hoc Reporting recipe, FERPA considerations</w:t>
+      </w:r>
+      <w:r>
+        <w:t xml:space="preserve"> </w:t>
+      </w:r>
+      <w:r>
+        <w:rPr>
+          <w:b/>
+          <w:bCs/>
+        </w:rPr>
+        <w:t xml:space="preserve">Teacher Quick-Push UI:</w:t>
+      </w:r>
+      <w:r>
+        <w:t xml:space="preserve"> </w:t>
+      </w:r>
+      <w:hyperlink r:id="rId11">
+        <w:r>
+          <w:rPr>
+            <w:rStyle w:val="Hyperlink"/>
+          </w:rPr>
+          <w:t xml:space="preserve">docs/teacher-quick-push.md</w:t>
+        </w:r>
+      </w:hyperlink>
+      <w:r>
+        <w:t xml:space="preserve"> </w:t>
+      </w:r>
+      <w:r>
+        <w:t xml:space="preserve">— bulk-award civic-readiness points to a class roster in one action</w:t>
       </w:r>
     </w:p>
     <w:p>
@@ -118,7 +199,7 @@
         </w:pict>
       </w:r>
     </w:p>
-    <w:bookmarkStart w:id="9" w:name="what-this-is"/>
+    <w:bookmarkStart w:id="12" w:name="what-this-is"/>
     <w:p>
       <w:pPr>
         <w:pStyle w:val="Heading2"/>
@@ -144,13 +225,25 @@
           <w:b/>
           <w:bCs/>
         </w:rPr>
-        <w:t xml:space="preserve">Phase 1 has zero IT dependency.</w:t>
-      </w:r>
-      <w:r>
-        <w:t xml:space="preserve"> </w:t>
-      </w:r>
-      <w:r>
-        <w:t xml:space="preserve">The application ships on free-tier SaaS (Vercel + Supabase + Resend), runs at $0/mo, and gives Social Studies a working URL within ~4 weeks of development start.</w:t>
+        <w:t xml:space="preserve">As of v0.2.0, the system is fully self-hostable on GNPS infrastructure.</w:t>
+      </w:r>
+      <w:r>
+        <w:t xml:space="preserve"> </w:t>
+      </w:r>
+      <w:r>
+        <w:t xml:space="preserve">Zero third-party SaaS dependencies. Any Linux box with Docker can run the entire stack — application, database, email, file storage, SSL termination — via</w:t>
+      </w:r>
+      <w:r>
+        <w:t xml:space="preserve"> </w:t>
+      </w:r>
+      <w:r>
+        <w:rPr>
+          <w:rStyle w:val="VerbatimChar"/>
+        </w:rPr>
+        <w:t xml:space="preserve">docker compose up</w:t>
+      </w:r>
+      <w:r>
+        <w:t xml:space="preserve">. Student records never leave the district.</w:t>
       </w:r>
     </w:p>
     <w:p>
@@ -158,23 +251,15 @@
         <w:pStyle w:val="BodyText"/>
       </w:pPr>
       <w:r>
-        <w:t xml:space="preserve">The items below are required only to</w:t>
-      </w:r>
-      <w:r>
-        <w:t xml:space="preserve"> </w:t>
-      </w:r>
-      <w:r>
-        <w:rPr>
-          <w:b/>
-          <w:bCs/>
-        </w:rPr>
-        <w:t xml:space="preserve">promote from Phase 1 (staff pilot) to Phase 2 (full launch with student-facing portal, district SSO, and live Infinite Campus integration).</w:t>
-      </w:r>
-      <w:r>
-        <w:t xml:space="preserve"> </w:t>
-      </w:r>
-      <w:r>
-        <w:t xml:space="preserve">They are listed in the order they typically need to be addressed.</w:t>
+        <w:t xml:space="preserve">Phase 1.5 (self-host) is the recommended deployment path for production. Phase 2 (live Infinite Campus integration) builds on top of Phase 1.5 once IT has the deploy stable.</w:t>
+      </w:r>
+    </w:p>
+    <w:p>
+      <w:pPr>
+        <w:pStyle w:val="BodyText"/>
+      </w:pPr>
+      <w:r>
+        <w:t xml:space="preserve">The items below are what IT needs to provide / configure to take the system live.</w:t>
       </w:r>
     </w:p>
     <w:p>
@@ -184,8 +269,8 @@
         </w:pict>
       </w:r>
     </w:p>
-    <w:bookmarkEnd w:id="9"/>
-    <w:bookmarkStart w:id="10" w:name="what-were-asking-of-gnps-technology"/>
+    <w:bookmarkEnd w:id="12"/>
+    <w:bookmarkStart w:id="14" w:name="what-were-asking-of-gnps-technology"/>
     <w:p>
       <w:pPr>
         <w:pStyle w:val="Heading2"/>
@@ -275,7 +360,7 @@
               <w:pStyle w:val="Compact"/>
             </w:pPr>
             <w:r>
-              <w:t xml:space="preserve">NYSED district application (Application Business Portal) — gates</w:t>
+              <w:t xml:space="preserve">NYSED district application (SED Application Business Portal) — gates</w:t>
             </w:r>
             <w:r>
               <w:t xml:space="preserve"> </w:t>
@@ -337,7 +422,53 @@
               <w:pStyle w:val="Compact"/>
             </w:pPr>
             <w:r>
-              <w:t xml:space="preserve">Domain CNAME — point</w:t>
+              <w:t xml:space="preserve">Provision a Linux VM (Ubuntu 22.04 / Debian 12 / Rocky 9 — district preference). 2 vCPU + 4 GB RAM + 50 GB disk. Public IP on ports 80/443. Outbound internet access.</w:t>
+            </w:r>
+          </w:p>
+        </w:tc>
+        <w:tc>
+          <w:tcPr/>
+          <w:p>
+            <w:pPr>
+              <w:pStyle w:val="Compact"/>
+            </w:pPr>
+            <w:r>
+              <w:t xml:space="preserve">~30 min</w:t>
+            </w:r>
+          </w:p>
+        </w:tc>
+        <w:tc>
+          <w:tcPr/>
+          <w:p>
+            <w:pPr>
+              <w:pStyle w:val="Compact"/>
+            </w:pPr>
+            <w:r>
+              <w:t xml:space="preserve">Infrastructure</w:t>
+            </w:r>
+          </w:p>
+        </w:tc>
+      </w:tr>
+      <w:tr>
+        <w:tc>
+          <w:tcPr/>
+          <w:p>
+            <w:pPr>
+              <w:pStyle w:val="Compact"/>
+            </w:pPr>
+            <w:r>
+              <w:t xml:space="preserve">3</w:t>
+            </w:r>
+          </w:p>
+        </w:tc>
+        <w:tc>
+          <w:tcPr/>
+          <w:p>
+            <w:pPr>
+              <w:pStyle w:val="Compact"/>
+            </w:pPr>
+            <w:r>
+              <w:t xml:space="preserve">DNS A record for</w:t>
             </w:r>
             <w:r>
               <w:t xml:space="preserve"> </w:t>
@@ -352,18 +483,18 @@
               <w:t xml:space="preserve"> </w:t>
             </w:r>
             <w:r>
-              <w:t xml:space="preserve">(or chosen subdomain) to Vercel</w:t>
-            </w:r>
-          </w:p>
-        </w:tc>
-        <w:tc>
-          <w:tcPr/>
-          <w:p>
-            <w:pPr>
-              <w:pStyle w:val="Compact"/>
-            </w:pPr>
-            <w:r>
-              <w:t xml:space="preserve">~5 minutes</w:t>
+              <w:t xml:space="preserve">pointing at the VM’s public IP. Caddy auto-issues a Let’s Encrypt cert on first boot.</w:t>
+            </w:r>
+          </w:p>
+        </w:tc>
+        <w:tc>
+          <w:tcPr/>
+          <w:p>
+            <w:pPr>
+              <w:pStyle w:val="Compact"/>
+            </w:pPr>
+            <w:r>
+              <w:t xml:space="preserve">~5 min</w:t>
             </w:r>
           </w:p>
         </w:tc>
@@ -387,52 +518,6 @@
               <w:pStyle w:val="Compact"/>
             </w:pPr>
             <w:r>
-              <w:t xml:space="preserve">3</w:t>
-            </w:r>
-          </w:p>
-        </w:tc>
-        <w:tc>
-          <w:tcPr/>
-          <w:p>
-            <w:pPr>
-              <w:pStyle w:val="Compact"/>
-            </w:pPr>
-            <w:r>
-              <w:t xml:space="preserve">FERPA / privacy review of the Phase 1 architecture (Supabase US-East, encrypted at rest + in transit, role-based access, full audit log); sign Supabase DPA if district policy requires</w:t>
-            </w:r>
-          </w:p>
-        </w:tc>
-        <w:tc>
-          <w:tcPr/>
-          <w:p>
-            <w:pPr>
-              <w:pStyle w:val="Compact"/>
-            </w:pPr>
-            <w:r>
-              <w:t xml:space="preserve">~1–2 hours</w:t>
-            </w:r>
-          </w:p>
-        </w:tc>
-        <w:tc>
-          <w:tcPr/>
-          <w:p>
-            <w:pPr>
-              <w:pStyle w:val="Compact"/>
-            </w:pPr>
-            <w:r>
-              <w:t xml:space="preserve">Privacy/Compliance + IT</w:t>
-            </w:r>
-          </w:p>
-        </w:tc>
-      </w:tr>
-      <w:tr>
-        <w:tc>
-          <w:tcPr/>
-          <w:p>
-            <w:pPr>
-              <w:pStyle w:val="Compact"/>
-            </w:pPr>
-            <w:r>
               <w:t xml:space="preserve">4</w:t>
             </w:r>
           </w:p>
@@ -444,99 +529,22 @@
               <w:pStyle w:val="Compact"/>
             </w:pPr>
             <w:r>
-              <w:t xml:space="preserve">SSO integration — choose ClassLink / Google Workspace / Azure AD; configurable in Supabase Auth providers (no application code change)</w:t>
-            </w:r>
-          </w:p>
-        </w:tc>
-        <w:tc>
-          <w:tcPr/>
-          <w:p>
-            <w:pPr>
-              <w:pStyle w:val="Compact"/>
-            </w:pPr>
-            <w:r>
-              <w:t xml:space="preserve">~1 day</w:t>
-            </w:r>
-          </w:p>
-        </w:tc>
-        <w:tc>
-          <w:tcPr/>
-          <w:p>
-            <w:pPr>
-              <w:pStyle w:val="Compact"/>
-            </w:pPr>
-            <w:r>
-              <w:t xml:space="preserve">Identity Management</w:t>
-            </w:r>
-          </w:p>
-        </w:tc>
-      </w:tr>
-      <w:tr>
-        <w:tc>
-          <w:tcPr/>
-          <w:p>
-            <w:pPr>
-              <w:pStyle w:val="Compact"/>
-            </w:pPr>
-            <w:r>
-              <w:t xml:space="preserve">5</w:t>
-            </w:r>
-          </w:p>
-        </w:tc>
-        <w:tc>
-          <w:tcPr/>
-          <w:p>
-            <w:pPr>
-              <w:pStyle w:val="Compact"/>
-            </w:pPr>
-            <w:r>
-              <w:t xml:space="preserve">Infinite Campus integration — read access to roster, course enrollment, Regents scores. Either OneRoster API or nightly CSV/SFTP export works</w:t>
-            </w:r>
-          </w:p>
-        </w:tc>
-        <w:tc>
-          <w:tcPr/>
-          <w:p>
-            <w:pPr>
-              <w:pStyle w:val="Compact"/>
-            </w:pPr>
-            <w:r>
-              <w:t xml:space="preserve">~2–4 hours scoping; setup varies</w:t>
-            </w:r>
-          </w:p>
-        </w:tc>
-        <w:tc>
-          <w:tcPr/>
-          <w:p>
-            <w:pPr>
-              <w:pStyle w:val="Compact"/>
-            </w:pPr>
-            <w:r>
-              <w:t xml:space="preserve">SIS Administrator</w:t>
-            </w:r>
-          </w:p>
-        </w:tc>
-      </w:tr>
-      <w:tr>
-        <w:tc>
-          <w:tcPr/>
-          <w:p>
-            <w:pPr>
-              <w:pStyle w:val="Compact"/>
-            </w:pPr>
-            <w:r>
-              <w:t xml:space="preserve">6</w:t>
-            </w:r>
-          </w:p>
-        </w:tc>
-        <w:tc>
-          <w:tcPr/>
-          <w:p>
-            <w:pPr>
-              <w:pStyle w:val="Compact"/>
-            </w:pPr>
-            <w:r>
-              <w:t xml:space="preserve">Email reputation — supervisor confirmations send from</w:t>
+              <w:t xml:space="preserve">SMTP credentials for the district mail server. Recommend creating a dedicated mailbox</w:t>
+            </w:r>
+            <w:r>
+              <w:t xml:space="preserve"> </w:t>
+            </w:r>
+            <w:r>
+              <w:rPr>
+                <w:rStyle w:val="VerbatimChar"/>
+              </w:rPr>
+              <w:t xml:space="preserve">civicseal-portal@greatneck.k12.ny.us</w:t>
+            </w:r>
+            <w:r>
+              <w:t xml:space="preserve"> </w:t>
+            </w:r>
+            <w:r>
+              <w:t xml:space="preserve">with auth to send as</w:t>
             </w:r>
             <w:r>
               <w:t xml:space="preserve"> </w:t>
@@ -548,18 +556,18 @@
               <w:t xml:space="preserve">civicseal@greatneck.k12.ny.us</w:t>
             </w:r>
             <w:r>
-              <w:t xml:space="preserve">. Either use district SMTP creds, or keep Resend and add SPF/DKIM records to GNPS DNS for the subdomain</w:t>
-            </w:r>
-          </w:p>
-        </w:tc>
-        <w:tc>
-          <w:tcPr/>
-          <w:p>
-            <w:pPr>
-              <w:pStyle w:val="Compact"/>
-            </w:pPr>
-            <w:r>
-              <w:t xml:space="preserve">~30 minutes</w:t>
+              <w:t xml:space="preserve">.</w:t>
+            </w:r>
+          </w:p>
+        </w:tc>
+        <w:tc>
+          <w:tcPr/>
+          <w:p>
+            <w:pPr>
+              <w:pStyle w:val="Compact"/>
+            </w:pPr>
+            <w:r>
+              <w:t xml:space="preserve">~1 hour</w:t>
             </w:r>
           </w:p>
         </w:tc>
@@ -583,18 +591,18 @@
               <w:pStyle w:val="Compact"/>
             </w:pPr>
             <w:r>
-              <w:t xml:space="preserve">7</w:t>
-            </w:r>
-          </w:p>
-        </w:tc>
-        <w:tc>
-          <w:tcPr/>
-          <w:p>
-            <w:pPr>
-              <w:pStyle w:val="Compact"/>
-            </w:pPr>
-            <w:r>
-              <w:t xml:space="preserve">Website integration — choose one of: (A)</w:t>
+              <w:t xml:space="preserve">5</w:t>
+            </w:r>
+          </w:p>
+        </w:tc>
+        <w:tc>
+          <w:tcPr/>
+          <w:p>
+            <w:pPr>
+              <w:pStyle w:val="Compact"/>
+            </w:pPr>
+            <w:r>
+              <w:t xml:space="preserve">FERPA / privacy review.</w:t>
             </w:r>
             <w:r>
               <w:t xml:space="preserve"> </w:t>
@@ -604,35 +612,35 @@
                 <w:b/>
                 <w:bCs/>
               </w:rPr>
-              <w:t xml:space="preserve">subdomain CNAME</w:t>
+              <w:t xml:space="preserve">Self-hosted v0.2.0 keeps all student data on district infrastructure</w:t>
             </w:r>
             <w:r>
               <w:t xml:space="preserve"> </w:t>
             </w:r>
             <w:r>
-              <w:t xml:space="preserve">[recommended], (B) iframe embed in Finalsite page, (C) reverse proxy via Finalsite or Cloudflare</w:t>
-            </w:r>
-          </w:p>
-        </w:tc>
-        <w:tc>
-          <w:tcPr/>
-          <w:p>
-            <w:pPr>
-              <w:pStyle w:val="Compact"/>
-            </w:pPr>
-            <w:r>
-              <w:t xml:space="preserve">A: 5 min · B: 30 min · C: ½ day</w:t>
-            </w:r>
-          </w:p>
-        </w:tc>
-        <w:tc>
-          <w:tcPr/>
-          <w:p>
-            <w:pPr>
-              <w:pStyle w:val="Compact"/>
-            </w:pPr>
-            <w:r>
-              <w:t xml:space="preserve">Web team</w:t>
+              <w:t xml:space="preserve">— no third-party data processor. Encryption at rest via the VM’s disk encryption (LUKS / cloud KMS). Audit log captures every state transition.</w:t>
+            </w:r>
+          </w:p>
+        </w:tc>
+        <w:tc>
+          <w:tcPr/>
+          <w:p>
+            <w:pPr>
+              <w:pStyle w:val="Compact"/>
+            </w:pPr>
+            <w:r>
+              <w:t xml:space="preserve">~1 hour</w:t>
+            </w:r>
+          </w:p>
+        </w:tc>
+        <w:tc>
+          <w:tcPr/>
+          <w:p>
+            <w:pPr>
+              <w:pStyle w:val="Compact"/>
+            </w:pPr>
+            <w:r>
+              <w:t xml:space="preserve">Privacy/Compliance</w:t>
             </w:r>
           </w:p>
         </w:tc>
@@ -645,6 +653,155 @@
               <w:pStyle w:val="Compact"/>
             </w:pPr>
             <w:r>
+              <w:t xml:space="preserve">6</w:t>
+            </w:r>
+          </w:p>
+        </w:tc>
+        <w:tc>
+          <w:tcPr/>
+          <w:p>
+            <w:pPr>
+              <w:pStyle w:val="Compact"/>
+            </w:pPr>
+            <w:r>
+              <w:t xml:space="preserve">Deploy:</w:t>
+            </w:r>
+            <w:r>
+              <w:t xml:space="preserve"> </w:t>
+            </w:r>
+            <w:r>
+              <w:rPr>
+                <w:rStyle w:val="VerbatimChar"/>
+              </w:rPr>
+              <w:t xml:space="preserve">git clone</w:t>
+            </w:r>
+            <w:r>
+              <w:t xml:space="preserve"> </w:t>
+            </w:r>
+            <w:r>
+              <w:t xml:space="preserve">→</w:t>
+            </w:r>
+            <w:r>
+              <w:t xml:space="preserve"> </w:t>
+            </w:r>
+            <w:r>
+              <w:rPr>
+                <w:rStyle w:val="VerbatimChar"/>
+              </w:rPr>
+              <w:t xml:space="preserve">cp .env.example .env</w:t>
+            </w:r>
+            <w:r>
+              <w:t xml:space="preserve"> </w:t>
+            </w:r>
+            <w:r>
+              <w:t xml:space="preserve">(fill in 7 values) →</w:t>
+            </w:r>
+            <w:r>
+              <w:t xml:space="preserve"> </w:t>
+            </w:r>
+            <w:r>
+              <w:rPr>
+                <w:rStyle w:val="VerbatimChar"/>
+              </w:rPr>
+              <w:t xml:space="preserve">make up</w:t>
+            </w:r>
+            <w:r>
+              <w:t xml:space="preserve">. Caddy obtains SSL automatically. Migrations apply automatically. ~10 minutes from clone to live URL.</w:t>
+            </w:r>
+          </w:p>
+        </w:tc>
+        <w:tc>
+          <w:tcPr/>
+          <w:p>
+            <w:pPr>
+              <w:pStyle w:val="Compact"/>
+            </w:pPr>
+            <w:r>
+              <w:t xml:space="preserve">~10 min once Steps 2–4 are done</w:t>
+            </w:r>
+          </w:p>
+        </w:tc>
+        <w:tc>
+          <w:tcPr/>
+          <w:p>
+            <w:pPr>
+              <w:pStyle w:val="Compact"/>
+            </w:pPr>
+            <w:r>
+              <w:t xml:space="preserve">IT (one engineer)</w:t>
+            </w:r>
+          </w:p>
+        </w:tc>
+      </w:tr>
+      <w:tr>
+        <w:tc>
+          <w:tcPr/>
+          <w:p>
+            <w:pPr>
+              <w:pStyle w:val="Compact"/>
+            </w:pPr>
+            <w:r>
+              <w:t xml:space="preserve">7</w:t>
+            </w:r>
+          </w:p>
+        </w:tc>
+        <w:tc>
+          <w:tcPr/>
+          <w:p>
+            <w:pPr>
+              <w:pStyle w:val="Compact"/>
+            </w:pPr>
+            <w:r>
+              <w:t xml:space="preserve">First admin:</w:t>
+            </w:r>
+            <w:r>
+              <w:t xml:space="preserve"> </w:t>
+            </w:r>
+            <w:r>
+              <w:rPr>
+                <w:rStyle w:val="VerbatimChar"/>
+              </w:rPr>
+              <w:t xml:space="preserve">make admin EMAIL=jon@greatneck.k12.ny.us</w:t>
+            </w:r>
+            <w:r>
+              <w:t xml:space="preserve"> </w:t>
+            </w:r>
+            <w:r>
+              <w:t xml:space="preserve">provisions the bootstrap admin. They log in via magic link and invite the rest of staff via the admin UI.</w:t>
+            </w:r>
+          </w:p>
+        </w:tc>
+        <w:tc>
+          <w:tcPr/>
+          <w:p>
+            <w:pPr>
+              <w:pStyle w:val="Compact"/>
+            </w:pPr>
+            <w:r>
+              <w:t xml:space="preserve">~5 min</w:t>
+            </w:r>
+          </w:p>
+        </w:tc>
+        <w:tc>
+          <w:tcPr/>
+          <w:p>
+            <w:pPr>
+              <w:pStyle w:val="Compact"/>
+            </w:pPr>
+            <w:r>
+              <w:t xml:space="preserve">IT</w:t>
+            </w:r>
+          </w:p>
+        </w:tc>
+      </w:tr>
+      <w:tr>
+        <w:tc>
+          <w:tcPr/>
+          <w:p>
+            <w:pPr>
+              <w:pStyle w:val="Compact"/>
+            </w:pPr>
+            <w:r>
               <w:t xml:space="preserve">8</w:t>
             </w:r>
           </w:p>
@@ -656,29 +813,197 @@
               <w:pStyle w:val="Compact"/>
             </w:pPr>
             <w:r>
-              <w:t xml:space="preserve">Long-term hosting decision — keep free-tier Vercel + Supabase under a district-paid account (handles GNPS scale for years), or self-host the same code on GNPS infrastructure. No code changes either way</w:t>
-            </w:r>
-          </w:p>
-        </w:tc>
-        <w:tc>
-          <w:tcPr/>
-          <w:p>
-            <w:pPr>
-              <w:pStyle w:val="Compact"/>
-            </w:pPr>
-            <w:r>
-              <w:t xml:space="preserve">District policy decision</w:t>
-            </w:r>
-          </w:p>
-        </w:tc>
-        <w:tc>
-          <w:tcPr/>
-          <w:p>
-            <w:pPr>
-              <w:pStyle w:val="Compact"/>
-            </w:pPr>
-            <w:r>
-              <w:t xml:space="preserve">IT Leadership</w:t>
+              <w:t xml:space="preserve">Infinite Campus integration. Phase 1.5 supports manual quarterly CSV uploads (works today). Phase 2 wires the live SFTP / OneRoster path. See</w:t>
+            </w:r>
+            <w:r>
+              <w:t xml:space="preserve"> </w:t>
+            </w:r>
+            <w:hyperlink r:id="rId10">
+              <w:r>
+                <w:rPr>
+                  <w:rStyle w:val="Hyperlink"/>
+                </w:rPr>
+                <w:t xml:space="preserve">docs/infinite-campus-integration.md</w:t>
+              </w:r>
+            </w:hyperlink>
+            <w:r>
+              <w:t xml:space="preserve"> </w:t>
+            </w:r>
+            <w:r>
+              <w:t xml:space="preserve">for the IC Ad Hoc Reporting recipe + 8 specific vendor questions.</w:t>
+            </w:r>
+          </w:p>
+        </w:tc>
+        <w:tc>
+          <w:tcPr/>
+          <w:p>
+            <w:pPr>
+              <w:pStyle w:val="Compact"/>
+            </w:pPr>
+            <w:r>
+              <w:t xml:space="preserve">Phase 1.5: ~30 min/quarter; Phase 2: 1–2 weeks of integration work</w:t>
+            </w:r>
+          </w:p>
+        </w:tc>
+        <w:tc>
+          <w:tcPr/>
+          <w:p>
+            <w:pPr>
+              <w:pStyle w:val="Compact"/>
+            </w:pPr>
+            <w:r>
+              <w:t xml:space="preserve">SIS Administrator</w:t>
+            </w:r>
+          </w:p>
+        </w:tc>
+      </w:tr>
+      <w:tr>
+        <w:tc>
+          <w:tcPr/>
+          <w:p>
+            <w:pPr>
+              <w:pStyle w:val="Compact"/>
+            </w:pPr>
+            <w:r>
+              <w:t xml:space="preserve">9</w:t>
+            </w:r>
+          </w:p>
+        </w:tc>
+        <w:tc>
+          <w:tcPr/>
+          <w:p>
+            <w:pPr>
+              <w:pStyle w:val="Compact"/>
+            </w:pPr>
+            <w:r>
+              <w:t xml:space="preserve">Backups: nightly cron script ships</w:t>
+            </w:r>
+            <w:r>
+              <w:t xml:space="preserve"> </w:t>
+            </w:r>
+            <w:r>
+              <w:rPr>
+                <w:rStyle w:val="VerbatimChar"/>
+              </w:rPr>
+              <w:t xml:space="preserve">pg_dump</w:t>
+            </w:r>
+            <w:r>
+              <w:t xml:space="preserve"> </w:t>
+            </w:r>
+            <w:r>
+              <w:t xml:space="preserve">+ evidence-data tarball off-host. Sample script in</w:t>
+            </w:r>
+            <w:r>
+              <w:t xml:space="preserve"> </w:t>
+            </w:r>
+            <w:hyperlink r:id="rId13">
+              <w:r>
+                <w:rPr>
+                  <w:rStyle w:val="Hyperlink"/>
+                </w:rPr>
+                <w:t xml:space="preserve">docs/it-runbook.md §6</w:t>
+              </w:r>
+            </w:hyperlink>
+            <w:r>
+              <w:t xml:space="preserve">.</w:t>
+            </w:r>
+          </w:p>
+        </w:tc>
+        <w:tc>
+          <w:tcPr/>
+          <w:p>
+            <w:pPr>
+              <w:pStyle w:val="Compact"/>
+            </w:pPr>
+            <w:r>
+              <w:t xml:space="preserve">~30 min</w:t>
+            </w:r>
+          </w:p>
+        </w:tc>
+        <w:tc>
+          <w:tcPr/>
+          <w:p>
+            <w:pPr>
+              <w:pStyle w:val="Compact"/>
+            </w:pPr>
+            <w:r>
+              <w:t xml:space="preserve">IT</w:t>
+            </w:r>
+          </w:p>
+        </w:tc>
+      </w:tr>
+      <w:tr>
+        <w:tc>
+          <w:tcPr/>
+          <w:p>
+            <w:pPr>
+              <w:pStyle w:val="Compact"/>
+            </w:pPr>
+            <w:r>
+              <w:t xml:space="preserve">10</w:t>
+            </w:r>
+          </w:p>
+        </w:tc>
+        <w:tc>
+          <w:tcPr/>
+          <w:p>
+            <w:pPr>
+              <w:pStyle w:val="Compact"/>
+            </w:pPr>
+            <w:r>
+              <w:t xml:space="preserve">Updates:</w:t>
+            </w:r>
+            <w:r>
+              <w:t xml:space="preserve"> </w:t>
+            </w:r>
+            <w:r>
+              <w:rPr>
+                <w:rStyle w:val="VerbatimChar"/>
+              </w:rPr>
+              <w:t xml:space="preserve">git pull</w:t>
+            </w:r>
+            <w:r>
+              <w:t xml:space="preserve"> </w:t>
+            </w:r>
+            <w:r>
+              <w:t xml:space="preserve">+</w:t>
+            </w:r>
+            <w:r>
+              <w:t xml:space="preserve"> </w:t>
+            </w:r>
+            <w:r>
+              <w:rPr>
+                <w:rStyle w:val="VerbatimChar"/>
+              </w:rPr>
+              <w:t xml:space="preserve">make up</w:t>
+            </w:r>
+            <w:r>
+              <w:t xml:space="preserve"> </w:t>
+            </w:r>
+            <w:r>
+              <w:t xml:space="preserve">rebuilds + restarts (~30s outage). Schedule outside school hours. Schema migrations are idempotent.</w:t>
+            </w:r>
+          </w:p>
+        </w:tc>
+        <w:tc>
+          <w:tcPr/>
+          <w:p>
+            <w:pPr>
+              <w:pStyle w:val="Compact"/>
+            </w:pPr>
+            <w:r>
+              <w:t xml:space="preserve">per release</w:t>
+            </w:r>
+          </w:p>
+        </w:tc>
+        <w:tc>
+          <w:tcPr/>
+          <w:p>
+            <w:pPr>
+              <w:pStyle w:val="Compact"/>
+            </w:pPr>
+            <w:r>
+              <w:t xml:space="preserve">IT</w:t>
             </w:r>
           </w:p>
         </w:tc>
@@ -691,14 +1016,14 @@
         </w:pict>
       </w:r>
     </w:p>
-    <w:bookmarkEnd w:id="10"/>
-    <w:bookmarkStart w:id="11" w:name="architecture-summary-phase-2-target"/>
+    <w:bookmarkEnd w:id="14"/>
+    <w:bookmarkStart w:id="15" w:name="Xdf5f6701fa8a8ce849350c238f7880e43209291"/>
     <w:p>
       <w:pPr>
         <w:pStyle w:val="Heading2"/>
       </w:pPr>
       <w:r>
-        <w:t xml:space="preserve">Architecture summary (Phase 2 target)</w:t>
+        <w:t xml:space="preserve">Architecture summary (v0.2.0 self-hosted, on GNPS infrastructure)</w:t>
       </w:r>
     </w:p>
     <w:p>
@@ -709,7 +1034,7 @@
         <w:rPr>
           <w:rStyle w:val="VerbatimChar"/>
         </w:rPr>
-        <w:t xml:space="preserve">                      ┌─────────────────────────────────┐</w:t>
+        <w:t xml:space="preserve">                      Internet</w:t>
       </w:r>
       <w:r>
         <w:br/>
@@ -718,7 +1043,7 @@
         <w:rPr>
           <w:rStyle w:val="VerbatimChar"/>
         </w:rPr>
-        <w:t xml:space="preserve">   Students ─────▶    │  civicseal.greatneck.k12.ny.us  │</w:t>
+        <w:t xml:space="preserve">                         │</w:t>
       </w:r>
       <w:r>
         <w:br/>
@@ -727,7 +1052,7 @@
         <w:rPr>
           <w:rStyle w:val="VerbatimChar"/>
         </w:rPr>
-        <w:t xml:space="preserve">   Counselors ───▶    │     (Vercel · SvelteKit app)    │</w:t>
+        <w:t xml:space="preserve">                         ▼  (HTTPS — Let's Encrypt cert auto-renewed)</w:t>
       </w:r>
       <w:r>
         <w:br/>
@@ -736,7 +1061,7 @@
         <w:rPr>
           <w:rStyle w:val="VerbatimChar"/>
         </w:rPr>
-        <w:t xml:space="preserve">   SCRC ─────────▶    └────────┬────────────────────────┘</w:t>
+        <w:t xml:space="preserve">            ┌────────────────────────────┐</w:t>
       </w:r>
       <w:r>
         <w:br/>
@@ -745,7 +1070,7 @@
         <w:rPr>
           <w:rStyle w:val="VerbatimChar"/>
         </w:rPr>
-        <w:t xml:space="preserve">                               │</w:t>
+        <w:t xml:space="preserve">            │  Caddy (port 443)          │</w:t>
       </w:r>
       <w:r>
         <w:br/>
@@ -754,7 +1079,7 @@
         <w:rPr>
           <w:rStyle w:val="VerbatimChar"/>
         </w:rPr>
-        <w:t xml:space="preserve">                       ┌───────┴──────────────────────────┐</w:t>
+        <w:t xml:space="preserve">            │  reverse proxy + SSL term  │</w:t>
       </w:r>
       <w:r>
         <w:br/>
@@ -763,7 +1088,7 @@
         <w:rPr>
           <w:rStyle w:val="VerbatimChar"/>
         </w:rPr>
-        <w:t xml:space="preserve">                       │                                  │</w:t>
+        <w:t xml:space="preserve">            └──────────────┬─────────────┘</w:t>
       </w:r>
       <w:r>
         <w:br/>
@@ -772,7 +1097,7 @@
         <w:rPr>
           <w:rStyle w:val="VerbatimChar"/>
         </w:rPr>
-        <w:t xml:space="preserve">                       ▼                                  ▼</w:t>
+        <w:t xml:space="preserve">                           │ http://app:3000  (internal Docker network)</w:t>
       </w:r>
       <w:r>
         <w:br/>
@@ -781,7 +1106,7 @@
         <w:rPr>
           <w:rStyle w:val="VerbatimChar"/>
         </w:rPr>
-        <w:t xml:space="preserve">              ┌──────────────────┐             ┌──────────────────┐</w:t>
+        <w:t xml:space="preserve">                           ▼</w:t>
       </w:r>
       <w:r>
         <w:br/>
@@ -790,7 +1115,7 @@
         <w:rPr>
           <w:rStyle w:val="VerbatimChar"/>
         </w:rPr>
-        <w:t xml:space="preserve">              │  Supabase        │             │  GNPS Identity   │</w:t>
+        <w:t xml:space="preserve">            ┌────────────────────────────┐</w:t>
       </w:r>
       <w:r>
         <w:br/>
@@ -799,7 +1124,7 @@
         <w:rPr>
           <w:rStyle w:val="VerbatimChar"/>
         </w:rPr>
-        <w:t xml:space="preserve">              │  Postgres + Auth │             │  Provider (SSO)  │</w:t>
+        <w:t xml:space="preserve">            │  SvelteKit app (Node 22)   │   the application</w:t>
       </w:r>
       <w:r>
         <w:br/>
@@ -808,7 +1133,7 @@
         <w:rPr>
           <w:rStyle w:val="VerbatimChar"/>
         </w:rPr>
-        <w:t xml:space="preserve">              │  (FERPA-DPA'd)   │             │  ClassLink/      │</w:t>
+        <w:t xml:space="preserve">            └──────┬─────────────┬───────┘</w:t>
       </w:r>
       <w:r>
         <w:br/>
@@ -817,7 +1142,7 @@
         <w:rPr>
           <w:rStyle w:val="VerbatimChar"/>
         </w:rPr>
-        <w:t xml:space="preserve">              └────┬─────────────┘             │  Google/Azure    │</w:t>
+        <w:t xml:space="preserve">                   │             │</w:t>
       </w:r>
       <w:r>
         <w:br/>
@@ -826,7 +1151,7 @@
         <w:rPr>
           <w:rStyle w:val="VerbatimChar"/>
         </w:rPr>
-        <w:t xml:space="preserve">                   │                           └──────────────────┘</w:t>
+        <w:t xml:space="preserve">                   │             └─▶ /app/evidence-data  (Docker volume)</w:t>
       </w:r>
       <w:r>
         <w:br/>
@@ -835,7 +1160,7 @@
         <w:rPr>
           <w:rStyle w:val="VerbatimChar"/>
         </w:rPr>
-        <w:t xml:space="preserve">                   │ nightly sync</w:t>
+        <w:t xml:space="preserve">                   │                  uploaded student artifacts</w:t>
       </w:r>
       <w:r>
         <w:br/>
@@ -853,7 +1178,7 @@
         <w:rPr>
           <w:rStyle w:val="VerbatimChar"/>
         </w:rPr>
-        <w:t xml:space="preserve">          ┌──────────────────────┐</w:t>
+        <w:t xml:space="preserve">            ┌────────────────────────────┐</w:t>
       </w:r>
       <w:r>
         <w:br/>
@@ -862,7 +1187,7 @@
         <w:rPr>
           <w:rStyle w:val="VerbatimChar"/>
         </w:rPr>
-        <w:t xml:space="preserve">          │  Infinite Campus     │</w:t>
+        <w:t xml:space="preserve">            │  Postgres 16               │   single relational store</w:t>
       </w:r>
       <w:r>
         <w:br/>
@@ -871,7 +1196,7 @@
         <w:rPr>
           <w:rStyle w:val="VerbatimChar"/>
         </w:rPr>
-        <w:t xml:space="preserve">          │  (OneRoster API or   │</w:t>
+        <w:t xml:space="preserve">            │  (Docker volume)           │   students, submissions, hours,</w:t>
       </w:r>
       <w:r>
         <w:br/>
@@ -880,7 +1205,7 @@
         <w:rPr>
           <w:rStyle w:val="VerbatimChar"/>
         </w:rPr>
-        <w:t xml:space="preserve">          │   SFTP CSV export)   │</w:t>
+        <w:t xml:space="preserve">            └────────────────────────────┘   evidence_files, course_catalog,</w:t>
       </w:r>
       <w:r>
         <w:br/>
@@ -889,19 +1214,103 @@
         <w:rPr>
           <w:rStyle w:val="VerbatimChar"/>
         </w:rPr>
-        <w:t xml:space="preserve">          └──────────────────────┘</w:t>
+        <w:t xml:space="preserve">                                             course_enrollment, regents_scores,</w:t>
       </w:r>
       <w:r>
         <w:br/>
       </w:r>
       <w:r>
+        <w:rPr>
+          <w:rStyle w:val="VerbatimChar"/>
+        </w:rPr>
+        <w:t xml:space="preserve">                                             users, audit_log, auth_tokens</w:t>
+      </w:r>
+      <w:r>
         <w:br/>
       </w:r>
       <w:r>
+        <w:br/>
+      </w:r>
+      <w:r>
         <w:rPr>
           <w:rStyle w:val="VerbatimChar"/>
         </w:rPr>
-        <w:t xml:space="preserve">Email out: Resend → SPF/DKIM-aligned to greatneck.k12.ny.us</w:t>
+        <w:t xml:space="preserve">Outbound:</w:t>
+      </w:r>
+      <w:r>
+        <w:br/>
+      </w:r>
+      <w:r>
+        <w:rPr>
+          <w:rStyle w:val="VerbatimChar"/>
+        </w:rPr>
+        <w:t xml:space="preserve">  └─▶ District SMTP server (port 587 STARTTLS) — supervisor confirmations,</w:t>
+      </w:r>
+      <w:r>
+        <w:br/>
+      </w:r>
+      <w:r>
+        <w:rPr>
+          <w:rStyle w:val="VerbatimChar"/>
+        </w:rPr>
+        <w:t xml:space="preserve">      student progress reports, staff magic-link sign-in</w:t>
+      </w:r>
+      <w:r>
+        <w:br/>
+      </w:r>
+      <w:r>
+        <w:br/>
+      </w:r>
+      <w:r>
+        <w:rPr>
+          <w:rStyle w:val="VerbatimChar"/>
+        </w:rPr>
+        <w:t xml:space="preserve">GNPS-hosted Linux VM, single host:</w:t>
+      </w:r>
+      <w:r>
+        <w:br/>
+      </w:r>
+      <w:r>
+        <w:rPr>
+          <w:rStyle w:val="VerbatimChar"/>
+        </w:rPr>
+        <w:t xml:space="preserve">  ~1 GB RAM total · 1 vCPU steady-state · ~1 GB disk growth/year</w:t>
+      </w:r>
+    </w:p>
+    <w:p>
+      <w:pPr>
+        <w:pStyle w:val="FirstParagraph"/>
+      </w:pPr>
+      <w:r>
+        <w:rPr>
+          <w:b/>
+          <w:bCs/>
+        </w:rPr>
+        <w:t xml:space="preserve">Trust boundary:</w:t>
+      </w:r>
+      <w:r>
+        <w:t xml:space="preserve"> </w:t>
+      </w:r>
+      <w:r>
+        <w:t xml:space="preserve">everything inside the Docker network is private. Only Caddy is on the public interface. Postgres + the app are not internet-reachable.</w:t>
+      </w:r>
+    </w:p>
+    <w:p>
+      <w:pPr>
+        <w:pStyle w:val="BodyText"/>
+      </w:pPr>
+      <w:r>
+        <w:rPr>
+          <w:b/>
+          <w:bCs/>
+        </w:rPr>
+        <w:t xml:space="preserve">Phase 2 enhancement (deferred):</w:t>
+      </w:r>
+      <w:r>
+        <w:t xml:space="preserve"> </w:t>
+      </w:r>
+      <w:r>
+        <w:t xml:space="preserve">swap self-hosted magic-link auth for district SSO (ClassLink / Google Workspace / Azure AD); add live Infinite Campus integration to replace quarterly CSV uploads. Code already supports both paths; only requires district IT decisions on identity provider + IC vendor coordination.</w:t>
       </w:r>
     </w:p>
     <w:p>
@@ -911,8 +1320,8 @@
         </w:pict>
       </w:r>
     </w:p>
-    <w:bookmarkEnd w:id="11"/>
-    <w:bookmarkStart w:id="12" w:name="cost-trajectory"/>
+    <w:bookmarkEnd w:id="15"/>
+    <w:bookmarkStart w:id="16" w:name="cost-trajectory"/>
     <w:p>
       <w:pPr>
         <w:pStyle w:val="Heading2"/>
@@ -1194,8 +1603,8 @@
         </w:pict>
       </w:r>
     </w:p>
-    <w:bookmarkEnd w:id="12"/>
-    <w:bookmarkStart w:id="13" w:name="what-we-are-not-asking"/>
+    <w:bookmarkEnd w:id="16"/>
+    <w:bookmarkStart w:id="17" w:name="what-we-are-not-asking"/>
     <w:p>
       <w:pPr>
         <w:pStyle w:val="Heading2"/>
@@ -1321,8 +1730,8 @@
         </w:pict>
       </w:r>
     </w:p>
-    <w:bookmarkEnd w:id="13"/>
-    <w:bookmarkStart w:id="15" w:name="Xf9464e39acbcb6ad6955937d736d3c80ef656a4"/>
+    <w:bookmarkEnd w:id="17"/>
+    <w:bookmarkStart w:id="19" w:name="Xf9464e39acbcb6ad6955937d736d3c80ef656a4"/>
     <w:p>
       <w:pPr>
         <w:pStyle w:val="Heading2"/>
@@ -1966,7 +2375,7 @@
       <w:r>
         <w:t xml:space="preserve"> </w:t>
       </w:r>
-      <w:hyperlink r:id="rId14">
+      <w:hyperlink r:id="rId18">
         <w:r>
           <w:rPr>
             <w:rStyle w:val="Hyperlink"/>
@@ -1988,8 +2397,8 @@
         </w:pict>
       </w:r>
     </w:p>
-    <w:bookmarkEnd w:id="15"/>
-    <w:bookmarkStart w:id="16" w:name="why-this-benefits-gnps"/>
+    <w:bookmarkEnd w:id="19"/>
+    <w:bookmarkStart w:id="20" w:name="why-this-benefits-gnps"/>
     <w:p>
       <w:pPr>
         <w:pStyle w:val="Heading2"/>
@@ -2093,8 +2502,8 @@
         </w:pict>
       </w:r>
     </w:p>
-    <w:bookmarkEnd w:id="16"/>
-    <w:bookmarkStart w:id="17" w:name="repository-contact"/>
+    <w:bookmarkEnd w:id="20"/>
+    <w:bookmarkStart w:id="21" w:name="repository-contact"/>
     <w:p>
       <w:pPr>
         <w:pStyle w:val="Heading2"/>
@@ -2213,8 +2622,8 @@
         <w:t xml:space="preserve">The full design document (architecture, data model, user flows, NYSED compliance mapping, repository structure, risks) is available as a 27-page companion PDF/DOCX.</w:t>
       </w:r>
     </w:p>
-    <w:bookmarkEnd w:id="17"/>
-    <w:bookmarkEnd w:id="18"/>
+    <w:bookmarkEnd w:id="21"/>
+    <w:bookmarkEnd w:id="22"/>
     <w:sectPr>
       <w:footnotePr>
         <w:numRestart w:val="eachSect"/>

</xml_diff>